<commit_message>
v2.27 (John's word, 8 October): day boxes under the homework practice wherever it is daily — Sessions 6, 8, 12, 14 (sheets still one page; S6 tightened, title rule kept); each deck's Four Parts slide re-cut from the new sheet
Co-Authored-By: Claude Opus 5.5 <noreply@anthropic.com>
</commit_message>
<xml_diff>
--- a/_implementation-notes/evening-series/handouts/FotH Pilot Session 12 Homework Handout DRAFT v1.docx
+++ b/_implementation-notes/evening-series/handouts/FotH Pilot Session 12 Homework Handout DRAFT v1.docx
@@ -474,6 +474,211 @@
     <w:bookmarkStart w:id="10" w:name="the-end-of-week-one-check-in"/>
     <w:p>
       <w:pPr>
+        <w:spacing w:after="140"/>
+      </w:pPr>
+      <w:r>
+        <w:rPr>
+          <w:i/>
+          <w:iCs/>
+          <w:sz w:val="20"/>
+          <w:szCs w:val="20"/>
+        </w:rPr>
+        <w:t>One box per day.</w:t>
+      </w:r>
+    </w:p>
+    <w:tbl>
+      <w:tblPr>
+        <w:tblStyle w:val="Table"/>
+        <w:tblW w:type="auto" w:w="0"/>
+        <w:tblLook w:firstRow="1" w:lastRow="0" w:firstColumn="0" w:lastColumn="0" w:noHBand="0" w:noVBand="0" w:val="0020"/>
+      </w:tblPr>
+      <w:tblGrid>
+        <w:gridCol w:w="1131"/>
+        <w:gridCol w:w="1131"/>
+        <w:gridCol w:w="1131"/>
+        <w:gridCol w:w="1131"/>
+        <w:gridCol w:w="1131"/>
+        <w:gridCol w:w="1131"/>
+        <w:gridCol w:w="1131"/>
+      </w:tblGrid>
+      <w:tr>
+        <w:trPr>
+          <w:tblHeader w:val="on"/>
+        </w:trPr>
+        <w:tc>
+          <w:tcPr/>
+          <w:p>
+            <w:pPr>
+              <w:pStyle w:val="Compact"/>
+              <w:jc w:val="center"/>
+            </w:pPr>
+            <w:r>
+              <w:t xml:space="preserve">M</w:t>
+            </w:r>
+          </w:p>
+        </w:tc>
+        <w:tc>
+          <w:tcPr/>
+          <w:p>
+            <w:pPr>
+              <w:pStyle w:val="Compact"/>
+              <w:jc w:val="center"/>
+            </w:pPr>
+            <w:r>
+              <w:t xml:space="preserve">Tu</w:t>
+            </w:r>
+          </w:p>
+        </w:tc>
+        <w:tc>
+          <w:tcPr/>
+          <w:p>
+            <w:pPr>
+              <w:pStyle w:val="Compact"/>
+              <w:jc w:val="center"/>
+            </w:pPr>
+            <w:r>
+              <w:t xml:space="preserve">W</w:t>
+            </w:r>
+          </w:p>
+        </w:tc>
+        <w:tc>
+          <w:tcPr/>
+          <w:p>
+            <w:pPr>
+              <w:pStyle w:val="Compact"/>
+              <w:jc w:val="center"/>
+            </w:pPr>
+            <w:r>
+              <w:t xml:space="preserve">Th</w:t>
+            </w:r>
+          </w:p>
+        </w:tc>
+        <w:tc>
+          <w:tcPr/>
+          <w:p>
+            <w:pPr>
+              <w:pStyle w:val="Compact"/>
+              <w:jc w:val="center"/>
+            </w:pPr>
+            <w:r>
+              <w:t xml:space="preserve">F</w:t>
+            </w:r>
+          </w:p>
+        </w:tc>
+        <w:tc>
+          <w:tcPr/>
+          <w:p>
+            <w:pPr>
+              <w:pStyle w:val="Compact"/>
+              <w:jc w:val="center"/>
+            </w:pPr>
+            <w:r>
+              <w:t xml:space="preserve">Sa</w:t>
+            </w:r>
+          </w:p>
+        </w:tc>
+        <w:tc>
+          <w:tcPr/>
+          <w:p>
+            <w:pPr>
+              <w:pStyle w:val="Compact"/>
+              <w:jc w:val="center"/>
+            </w:pPr>
+            <w:r>
+              <w:t xml:space="preserve">Su</w:t>
+            </w:r>
+          </w:p>
+        </w:tc>
+      </w:tr>
+      <w:tr>
+        <w:tc>
+          <w:tcPr/>
+          <w:p>
+            <w:pPr>
+              <w:pStyle w:val="Compact"/>
+              <w:jc w:val="center"/>
+            </w:pPr>
+            <w:r>
+              <w:t xml:space="preserve">☐</w:t>
+            </w:r>
+          </w:p>
+        </w:tc>
+        <w:tc>
+          <w:tcPr/>
+          <w:p>
+            <w:pPr>
+              <w:pStyle w:val="Compact"/>
+              <w:jc w:val="center"/>
+            </w:pPr>
+            <w:r>
+              <w:t xml:space="preserve">☐</w:t>
+            </w:r>
+          </w:p>
+        </w:tc>
+        <w:tc>
+          <w:tcPr/>
+          <w:p>
+            <w:pPr>
+              <w:pStyle w:val="Compact"/>
+              <w:jc w:val="center"/>
+            </w:pPr>
+            <w:r>
+              <w:t xml:space="preserve">☐</w:t>
+            </w:r>
+          </w:p>
+        </w:tc>
+        <w:tc>
+          <w:tcPr/>
+          <w:p>
+            <w:pPr>
+              <w:pStyle w:val="Compact"/>
+              <w:jc w:val="center"/>
+            </w:pPr>
+            <w:r>
+              <w:t xml:space="preserve">☐</w:t>
+            </w:r>
+          </w:p>
+        </w:tc>
+        <w:tc>
+          <w:tcPr/>
+          <w:p>
+            <w:pPr>
+              <w:pStyle w:val="Compact"/>
+              <w:jc w:val="center"/>
+            </w:pPr>
+            <w:r>
+              <w:t xml:space="preserve">☐</w:t>
+            </w:r>
+          </w:p>
+        </w:tc>
+        <w:tc>
+          <w:tcPr/>
+          <w:p>
+            <w:pPr>
+              <w:pStyle w:val="Compact"/>
+              <w:jc w:val="center"/>
+            </w:pPr>
+            <w:r>
+              <w:t xml:space="preserve">☐</w:t>
+            </w:r>
+          </w:p>
+        </w:tc>
+        <w:tc>
+          <w:tcPr/>
+          <w:p>
+            <w:pPr>
+              <w:pStyle w:val="Compact"/>
+              <w:jc w:val="center"/>
+            </w:pPr>
+            <w:r>
+              <w:t xml:space="preserve">☐</w:t>
+            </w:r>
+          </w:p>
+        </w:tc>
+      </w:tr>
+    </w:tbl>
+    <w:p>
+      <w:pPr>
         <w:pStyle w:val="Heading2"/>
       </w:pPr>
       <w:r>
@@ -572,6 +777,211 @@
     <w:bookmarkStart w:id="12" w:name="one-sentence-of-preparation"/>
     <w:p>
       <w:pPr>
+        <w:spacing w:after="140"/>
+      </w:pPr>
+      <w:r>
+        <w:rPr>
+          <w:i/>
+          <w:iCs/>
+          <w:sz w:val="20"/>
+          <w:szCs w:val="20"/>
+        </w:rPr>
+        <w:t>One box per day.</w:t>
+      </w:r>
+    </w:p>
+    <w:tbl>
+      <w:tblPr>
+        <w:tblStyle w:val="Table"/>
+        <w:tblW w:type="auto" w:w="0"/>
+        <w:tblLook w:firstRow="1" w:lastRow="0" w:firstColumn="0" w:lastColumn="0" w:noHBand="0" w:noVBand="0" w:val="0020"/>
+      </w:tblPr>
+      <w:tblGrid>
+        <w:gridCol w:w="1131"/>
+        <w:gridCol w:w="1131"/>
+        <w:gridCol w:w="1131"/>
+        <w:gridCol w:w="1131"/>
+        <w:gridCol w:w="1131"/>
+        <w:gridCol w:w="1131"/>
+        <w:gridCol w:w="1131"/>
+      </w:tblGrid>
+      <w:tr>
+        <w:trPr>
+          <w:tblHeader w:val="on"/>
+        </w:trPr>
+        <w:tc>
+          <w:tcPr/>
+          <w:p>
+            <w:pPr>
+              <w:pStyle w:val="Compact"/>
+              <w:jc w:val="center"/>
+            </w:pPr>
+            <w:r>
+              <w:t xml:space="preserve">M</w:t>
+            </w:r>
+          </w:p>
+        </w:tc>
+        <w:tc>
+          <w:tcPr/>
+          <w:p>
+            <w:pPr>
+              <w:pStyle w:val="Compact"/>
+              <w:jc w:val="center"/>
+            </w:pPr>
+            <w:r>
+              <w:t xml:space="preserve">Tu</w:t>
+            </w:r>
+          </w:p>
+        </w:tc>
+        <w:tc>
+          <w:tcPr/>
+          <w:p>
+            <w:pPr>
+              <w:pStyle w:val="Compact"/>
+              <w:jc w:val="center"/>
+            </w:pPr>
+            <w:r>
+              <w:t xml:space="preserve">W</w:t>
+            </w:r>
+          </w:p>
+        </w:tc>
+        <w:tc>
+          <w:tcPr/>
+          <w:p>
+            <w:pPr>
+              <w:pStyle w:val="Compact"/>
+              <w:jc w:val="center"/>
+            </w:pPr>
+            <w:r>
+              <w:t xml:space="preserve">Th</w:t>
+            </w:r>
+          </w:p>
+        </w:tc>
+        <w:tc>
+          <w:tcPr/>
+          <w:p>
+            <w:pPr>
+              <w:pStyle w:val="Compact"/>
+              <w:jc w:val="center"/>
+            </w:pPr>
+            <w:r>
+              <w:t xml:space="preserve">F</w:t>
+            </w:r>
+          </w:p>
+        </w:tc>
+        <w:tc>
+          <w:tcPr/>
+          <w:p>
+            <w:pPr>
+              <w:pStyle w:val="Compact"/>
+              <w:jc w:val="center"/>
+            </w:pPr>
+            <w:r>
+              <w:t xml:space="preserve">Sa</w:t>
+            </w:r>
+          </w:p>
+        </w:tc>
+        <w:tc>
+          <w:tcPr/>
+          <w:p>
+            <w:pPr>
+              <w:pStyle w:val="Compact"/>
+              <w:jc w:val="center"/>
+            </w:pPr>
+            <w:r>
+              <w:t xml:space="preserve">Su</w:t>
+            </w:r>
+          </w:p>
+        </w:tc>
+      </w:tr>
+      <w:tr>
+        <w:tc>
+          <w:tcPr/>
+          <w:p>
+            <w:pPr>
+              <w:pStyle w:val="Compact"/>
+              <w:jc w:val="center"/>
+            </w:pPr>
+            <w:r>
+              <w:t xml:space="preserve">☐</w:t>
+            </w:r>
+          </w:p>
+        </w:tc>
+        <w:tc>
+          <w:tcPr/>
+          <w:p>
+            <w:pPr>
+              <w:pStyle w:val="Compact"/>
+              <w:jc w:val="center"/>
+            </w:pPr>
+            <w:r>
+              <w:t xml:space="preserve">☐</w:t>
+            </w:r>
+          </w:p>
+        </w:tc>
+        <w:tc>
+          <w:tcPr/>
+          <w:p>
+            <w:pPr>
+              <w:pStyle w:val="Compact"/>
+              <w:jc w:val="center"/>
+            </w:pPr>
+            <w:r>
+              <w:t xml:space="preserve">☐</w:t>
+            </w:r>
+          </w:p>
+        </w:tc>
+        <w:tc>
+          <w:tcPr/>
+          <w:p>
+            <w:pPr>
+              <w:pStyle w:val="Compact"/>
+              <w:jc w:val="center"/>
+            </w:pPr>
+            <w:r>
+              <w:t xml:space="preserve">☐</w:t>
+            </w:r>
+          </w:p>
+        </w:tc>
+        <w:tc>
+          <w:tcPr/>
+          <w:p>
+            <w:pPr>
+              <w:pStyle w:val="Compact"/>
+              <w:jc w:val="center"/>
+            </w:pPr>
+            <w:r>
+              <w:t xml:space="preserve">☐</w:t>
+            </w:r>
+          </w:p>
+        </w:tc>
+        <w:tc>
+          <w:tcPr/>
+          <w:p>
+            <w:pPr>
+              <w:pStyle w:val="Compact"/>
+              <w:jc w:val="center"/>
+            </w:pPr>
+            <w:r>
+              <w:t xml:space="preserve">☐</w:t>
+            </w:r>
+          </w:p>
+        </w:tc>
+        <w:tc>
+          <w:tcPr/>
+          <w:p>
+            <w:pPr>
+              <w:pStyle w:val="Compact"/>
+              <w:jc w:val="center"/>
+            </w:pPr>
+            <w:r>
+              <w:t xml:space="preserve">☐</w:t>
+            </w:r>
+          </w:p>
+        </w:tc>
+      </w:tr>
+    </w:tbl>
+    <w:p>
+      <w:pPr>
         <w:pStyle w:val="Heading2"/>
       </w:pPr>
       <w:r>
@@ -600,13 +1010,6 @@
       </w:r>
       <w:r>
         <w:t xml:space="preserve">☐</w:t>
-      </w:r>
-    </w:p>
-    <w:p>
-      <w:r>
-        <w:pict>
-          <v:rect style="width:0;height:1.5pt" o:hralign="center" o:hrstd="t" o:hr="t"/>
-        </w:pict>
       </w:r>
     </w:p>
     <w:bookmarkEnd w:id="12"/>
@@ -615,6 +1018,7 @@
       <w:footnotePr>
         <w:numRestart w:val="eachSect"/>
       </w:footnotePr>
+      <w:pgMar w:top="864" w:bottom="864" w:left="1224" w:right="1224"/>
     </w:sectPr>
   </w:body>
 </w:document>

</xml_diff>